<commit_message>
mise a jour du rapport 	modified:   report.docx 	new file:   report.pdf
</commit_message>
<xml_diff>
--- a/report.docx
+++ b/report.docx
@@ -45,7 +45,7 @@
           <w:szCs w:val="20"/>
         </w:rPr>
         <w:lastRenderedPageBreak/>
-        <w:t xml:space="preserve">Francky Ronsard SAAH </w:t>
+        <w:t xml:space="preserve">FRANCKY RONSARD SAAH </w:t>
       </w:r>
       <w:r>
         <w:rPr>
@@ -75,17 +75,7 @@
           <w:sz w:val="20"/>
           <w:szCs w:val="20"/>
         </w:rPr>
-        <w:t>INFORMATION SYSTEM INGENEE</w:t>
-      </w:r>
-      <w:bookmarkStart w:id="0" w:name="_GoBack"/>
-      <w:bookmarkEnd w:id="0"/>
-      <w:r>
-        <w:rPr>
-          <w:i/>
-          <w:sz w:val="20"/>
-          <w:szCs w:val="20"/>
-        </w:rPr>
-        <w:t>RİNG</w:t>
+        <w:t>INFORMATION SYSTEM INGENEERİNG</w:t>
       </w:r>
       <w:r>
         <w:rPr>
@@ -202,12 +192,87 @@
     </w:p>
     <w:p>
       <w:pPr>
-        <w:pStyle w:val="Author"/>
-        <w:spacing w:before="100" w:beforeAutospacing="1"/>
-        <w:jc w:val="left"/>
-        <w:rPr>
-          <w:sz w:val="20"/>
-          <w:szCs w:val="20"/>
+        <w:pStyle w:val="NoSpacing"/>
+        <w:jc w:val="center"/>
+        <w:rPr>
+          <w:rFonts w:ascii="Times New Roman" w:hAnsi="Times New Roman" w:cs="Times New Roman"/>
+        </w:rPr>
+      </w:pPr>
+      <w:r>
+        <w:rPr>
+          <w:rFonts w:ascii="Times New Roman" w:hAnsi="Times New Roman" w:cs="Times New Roman"/>
+        </w:rPr>
+        <w:lastRenderedPageBreak/>
+        <w:t>TURAN ASGARLI</w:t>
+      </w:r>
+    </w:p>
+    <w:p>
+      <w:pPr>
+        <w:pStyle w:val="NoSpacing"/>
+        <w:jc w:val="center"/>
+        <w:rPr>
+          <w:rFonts w:ascii="Times New Roman" w:hAnsi="Times New Roman" w:cs="Times New Roman"/>
+          <w:i/>
+        </w:rPr>
+      </w:pPr>
+      <w:r>
+        <w:rPr>
+          <w:rFonts w:ascii="Times New Roman" w:hAnsi="Times New Roman" w:cs="Times New Roman"/>
+          <w:i/>
+        </w:rPr>
+        <w:t>TECHNOL</w:t>
+      </w:r>
+      <w:bookmarkStart w:id="0" w:name="_GoBack"/>
+      <w:bookmarkEnd w:id="0"/>
+      <w:r>
+        <w:rPr>
+          <w:rFonts w:ascii="Times New Roman" w:hAnsi="Times New Roman" w:cs="Times New Roman"/>
+          <w:i/>
+        </w:rPr>
+        <w:t>OGY FACULTY</w:t>
+      </w:r>
+    </w:p>
+    <w:p>
+      <w:pPr>
+        <w:pStyle w:val="NoSpacing"/>
+        <w:jc w:val="center"/>
+        <w:rPr>
+          <w:rFonts w:ascii="Times New Roman" w:hAnsi="Times New Roman" w:cs="Times New Roman"/>
+          <w:i/>
+        </w:rPr>
+      </w:pPr>
+      <w:r>
+        <w:rPr>
+          <w:rFonts w:ascii="Times New Roman" w:hAnsi="Times New Roman" w:cs="Times New Roman"/>
+          <w:i/>
+        </w:rPr>
+        <w:t>INFORMATION SYSTEM INGENEERİNG</w:t>
+      </w:r>
+    </w:p>
+    <w:p>
+      <w:pPr>
+        <w:pStyle w:val="NoSpacing"/>
+        <w:jc w:val="center"/>
+        <w:rPr>
+          <w:rFonts w:ascii="Times New Roman" w:hAnsi="Times New Roman" w:cs="Times New Roman"/>
+          <w:lang w:val="fr-CA"/>
+        </w:rPr>
+      </w:pPr>
+      <w:r>
+        <w:rPr>
+          <w:rFonts w:ascii="Times New Roman" w:hAnsi="Times New Roman" w:cs="Times New Roman"/>
+          <w:lang w:val="fr-CA"/>
+        </w:rPr>
+        <w:t>KOCAELI, TURKEY</w:t>
+      </w:r>
+    </w:p>
+    <w:p>
+      <w:pPr>
+        <w:pStyle w:val="NoSpacing"/>
+        <w:jc w:val="center"/>
+        <w:rPr>
+          <w:rFonts w:ascii="Times New Roman" w:hAnsi="Times New Roman" w:cs="Times New Roman"/>
+          <w:lang w:val="fr-CA"/>
         </w:rPr>
         <w:sectPr>
           <w:type w:val="continuous"/>
@@ -217,79 +282,23 @@
           <w:docGrid w:linePitch="360"/>
         </w:sectPr>
       </w:pPr>
-      <w:r>
-        <w:rPr>
-          <w:i/>
-          <w:sz w:val="20"/>
-          <w:szCs w:val="20"/>
-        </w:rPr>
-        <w:lastRenderedPageBreak/>
-        <w:t>TECHNOLOGY FACULTY</w:t>
-      </w:r>
-      <w:r>
-        <w:rPr>
-          <w:sz w:val="20"/>
-          <w:szCs w:val="20"/>
-        </w:rPr>
-        <w:br/>
-      </w:r>
-      <w:r>
-        <w:rPr>
-          <w:i/>
-          <w:sz w:val="20"/>
-          <w:szCs w:val="20"/>
-        </w:rPr>
-        <w:t>INFORMATION SYSTEM INGENEERİNG</w:t>
-      </w:r>
-      <w:r>
-        <w:rPr>
-          <w:i/>
-          <w:sz w:val="20"/>
-          <w:szCs w:val="20"/>
-        </w:rPr>
-        <w:br/>
-      </w:r>
-      <w:r>
-        <w:rPr>
-          <w:sz w:val="20"/>
-          <w:szCs w:val="20"/>
-        </w:rPr>
-        <w:t>KOCAELI, TURKEY</w:t>
-      </w:r>
+      <w:hyperlink r:id="rId10" w:history="1">
+        <w:r>
+          <w:rPr>
+            <w:rStyle w:val="Hyperlink"/>
+            <w:rFonts w:ascii="Times New Roman" w:hAnsi="Times New Roman" w:cs="Times New Roman"/>
+            <w:lang w:val="fr-CA"/>
+          </w:rPr>
+          <w:t>turanaskerov2004@gmail.com</w:t>
+        </w:r>
+      </w:hyperlink>
     </w:p>
     <w:p>
       <w:pPr>
         <w:pStyle w:val="IEEEnormalparagraph"/>
         <w:ind w:firstLine="0"/>
         <w:rPr>
-          <w:lang w:val="en-US"/>
-        </w:rPr>
-      </w:pPr>
-    </w:p>
-    <w:p>
-      <w:pPr>
-        <w:pStyle w:val="IEEEnormalparagraph"/>
-        <w:ind w:firstLine="0"/>
-        <w:rPr>
-          <w:lang w:val="en-US"/>
-        </w:rPr>
-      </w:pPr>
-    </w:p>
-    <w:p>
-      <w:pPr>
-        <w:pStyle w:val="IEEEnormalparagraph"/>
-        <w:ind w:firstLine="0"/>
-        <w:rPr>
-          <w:lang w:val="en-US"/>
-        </w:rPr>
-      </w:pPr>
-    </w:p>
-    <w:p>
-      <w:pPr>
-        <w:pStyle w:val="IEEEnormalparagraph"/>
-        <w:ind w:firstLine="0"/>
-        <w:rPr>
-          <w:lang w:val="en-US"/>
+          <w:lang w:val="fr-CA"/>
         </w:rPr>
         <w:sectPr>
           <w:type w:val="continuous"/>
@@ -303,16 +312,9 @@
     <w:p>
       <w:pPr>
         <w:pStyle w:val="IEEEnormalparagraph"/>
-        <w:rPr>
-          <w:lang w:val="tr-TR"/>
-        </w:rPr>
-      </w:pPr>
-    </w:p>
-    <w:p>
-      <w:pPr>
-        <w:pStyle w:val="IEEEnormalparagraph"/>
-        <w:rPr>
-          <w:lang w:val="en-US"/>
+        <w:ind w:firstLine="0"/>
+        <w:rPr>
+          <w:lang w:val="fr-CA"/>
         </w:rPr>
         <w:sectPr>
           <w:type w:val="continuous"/>
@@ -326,6 +328,7 @@
     <w:p>
       <w:pPr>
         <w:pStyle w:val="IEEEnormalparagraph"/>
+        <w:ind w:firstLine="0"/>
         <w:rPr>
           <w:lang w:val="tr-TR"/>
         </w:rPr>
@@ -494,7 +497,6 @@
         <w:t xml:space="preserve"> </w:t>
       </w:r>
       <w:r>
-        <w:lastRenderedPageBreak/>
         <w:t>there is a demand for an automated system that streamlines this process while ensuring security, scalability, and integration with official government databases.</w:t>
       </w:r>
     </w:p>
@@ -511,6 +513,7 @@
         <w:rPr>
           <w:rStyle w:val="Strong"/>
         </w:rPr>
+        <w:lastRenderedPageBreak/>
         <w:t>Objectives</w:t>
       </w:r>
     </w:p>
@@ -833,7 +836,6 @@
         <w:pStyle w:val="IEEEnormalparagraph"/>
       </w:pPr>
       <w:r>
-        <w:lastRenderedPageBreak/>
         <w:t>This system contributes to the academic recruitment process by:</w:t>
       </w:r>
     </w:p>
@@ -885,6 +887,7 @@
         <w:rPr>
           <w:rStyle w:val="Strong"/>
         </w:rPr>
+        <w:lastRenderedPageBreak/>
         <w:t>Ensuring security and integrity</w:t>
       </w:r>
       <w:r>
@@ -1270,7 +1273,6 @@
         <w:pStyle w:val="IEEEnormalparagraph"/>
       </w:pPr>
       <w:r>
-        <w:lastRenderedPageBreak/>
         <w:t>The system relies on a full-stack JavaScript ecosystem, with the following key technologies:</w:t>
       </w:r>
     </w:p>
@@ -1432,6 +1434,7 @@
               <w:rPr>
                 <w:b/>
               </w:rPr>
+              <w:lastRenderedPageBreak/>
               <w:t>Backend</w:t>
             </w:r>
           </w:p>
@@ -1925,7 +1928,7 @@
                     </pic:cNvPicPr>
                   </pic:nvPicPr>
                   <pic:blipFill>
-                    <a:blip r:embed="rId10" cstate="print">
+                    <a:blip r:embed="rId11" cstate="print">
                       <a:extLst>
                         <a:ext uri="{28A0092B-C50C-407E-A947-70E740481C1C}">
                           <a14:useLocalDpi xmlns:a14="http://schemas.microsoft.com/office/drawing/2010/main" val="0"/>
@@ -2084,6 +2087,7 @@
         <w:rPr>
           <w:rStyle w:val="Strong"/>
         </w:rPr>
+        <w:lastRenderedPageBreak/>
         <w:t>Automatic Login</w:t>
       </w:r>
       <w:r>
@@ -2519,7 +2523,7 @@
             <o:lock v:ext="edit" aspectratio="t"/>
           </v:shapetype>
           <v:shape id="_x0000_i1025" type="#_x0000_t75" style="width:231.65pt;height:649.9pt">
-            <v:imagedata r:id="rId11" o:title="user-login-registration-process"/>
+            <v:imagedata r:id="rId12" o:title="user-login-registration-process"/>
           </v:shape>
         </w:pict>
       </w:r>
@@ -3403,7 +3407,7 @@
                     </pic:cNvPicPr>
                   </pic:nvPicPr>
                   <pic:blipFill>
-                    <a:blip r:embed="rId12">
+                    <a:blip r:embed="rId13">
                       <a:extLst>
                         <a:ext uri="{28A0092B-C50C-407E-A947-70E740481C1C}">
                           <a14:useLocalDpi xmlns:a14="http://schemas.microsoft.com/office/drawing/2010/main" val="0"/>
@@ -4345,7 +4349,7 @@
         <w:lastRenderedPageBreak/>
         <w:pict>
           <v:shape id="_x0000_i1026" type="#_x0000_t75" style="width:222.9pt;height:535.3pt">
-            <v:imagedata r:id="rId13" o:title="system-function"/>
+            <v:imagedata r:id="rId14" o:title="system-function"/>
           </v:shape>
         </w:pict>
       </w:r>
@@ -5263,7 +5267,7 @@
                     </pic:cNvPicPr>
                   </pic:nvPicPr>
                   <pic:blipFill>
-                    <a:blip r:embed="rId14">
+                    <a:blip r:embed="rId15">
                       <a:extLst>
                         <a:ext uri="{28A0092B-C50C-407E-A947-70E740481C1C}">
                           <a14:useLocalDpi xmlns:a14="http://schemas.microsoft.com/office/drawing/2010/main" val="0"/>
@@ -6136,13 +6140,7 @@
         <w:rPr>
           <w:lang w:val="tr-TR"/>
         </w:rPr>
-        <w:t>admin</w:t>
-      </w:r>
-      <w:r>
-        <w:rPr>
-          <w:lang w:val="tr-TR"/>
-        </w:rPr>
-        <w:t xml:space="preserve"> </w:t>
+        <w:t xml:space="preserve">admin </w:t>
       </w:r>
       <w:r>
         <w:t>(</w:t>
@@ -6178,13 +6176,7 @@
         <w:rPr>
           <w:lang w:val="tr-TR"/>
         </w:rPr>
-        <w:t>jury</w:t>
-      </w:r>
-      <w:r>
-        <w:rPr>
-          <w:lang w:val="tr-TR"/>
-        </w:rPr>
-        <w:t xml:space="preserve"> </w:t>
+        <w:t xml:space="preserve">jury </w:t>
       </w:r>
       <w:r>
         <w:t>(</w:t>
@@ -10130,7 +10122,7 @@
       <w:r>
         <w:pict>
           <v:shape id="_x0000_i1027" type="#_x0000_t75" style="width:257.95pt;height:344.95pt">
-            <v:imagedata r:id="rId15" o:title="kouapp-database-graphic"/>
+            <v:imagedata r:id="rId16" o:title="kouapp-database-graphic"/>
           </v:shape>
         </w:pict>
       </w:r>
@@ -21085,7 +21077,6 @@
           <w:color w:val="CCCCCC"/>
           <w:sz w:val="20"/>
           <w:szCs w:val="20"/>
-          <w:lang w:val="fr-CA"/>
         </w:rPr>
       </w:pPr>
       <w:r>
@@ -21094,7 +21085,6 @@
           <w:color w:val="4EC9B0"/>
           <w:sz w:val="20"/>
           <w:szCs w:val="20"/>
-          <w:lang w:val="fr-CA"/>
         </w:rPr>
         <w:t>exports</w:t>
       </w:r>
@@ -21104,7 +21094,6 @@
           <w:color w:val="CCCCCC"/>
           <w:sz w:val="20"/>
           <w:szCs w:val="20"/>
-          <w:lang w:val="fr-CA"/>
         </w:rPr>
         <w:t>.</w:t>
       </w:r>
@@ -21114,7 +21103,6 @@
           <w:color w:val="DCDCAA"/>
           <w:sz w:val="20"/>
           <w:szCs w:val="20"/>
-          <w:lang w:val="fr-CA"/>
         </w:rPr>
         <w:t>controlUser</w:t>
       </w:r>
@@ -21124,7 +21112,6 @@
           <w:color w:val="CCCCCC"/>
           <w:sz w:val="20"/>
           <w:szCs w:val="20"/>
-          <w:lang w:val="fr-CA"/>
         </w:rPr>
         <w:t xml:space="preserve"> </w:t>
       </w:r>
@@ -21134,7 +21121,6 @@
           <w:color w:val="D4D4D4"/>
           <w:sz w:val="20"/>
           <w:szCs w:val="20"/>
-          <w:lang w:val="fr-CA"/>
         </w:rPr>
         <w:t>=</w:t>
       </w:r>
@@ -21144,7 +21130,6 @@
           <w:color w:val="CCCCCC"/>
           <w:sz w:val="20"/>
           <w:szCs w:val="20"/>
-          <w:lang w:val="fr-CA"/>
         </w:rPr>
         <w:t xml:space="preserve"> </w:t>
       </w:r>
@@ -21153,7 +21138,6 @@
           <w:rFonts w:ascii="Times New Roman" w:hAnsi="Times New Roman"/>
           <w:sz w:val="20"/>
           <w:szCs w:val="20"/>
-          <w:lang w:val="fr-CA"/>
         </w:rPr>
         <w:t>async</w:t>
       </w:r>
@@ -21163,7 +21147,6 @@
           <w:color w:val="CCCCCC"/>
           <w:sz w:val="20"/>
           <w:szCs w:val="20"/>
-          <w:lang w:val="fr-CA"/>
         </w:rPr>
         <w:t xml:space="preserve"> (</w:t>
       </w:r>
@@ -21172,7 +21155,6 @@
           <w:rFonts w:ascii="Times New Roman" w:hAnsi="Times New Roman"/>
           <w:sz w:val="20"/>
           <w:szCs w:val="20"/>
-          <w:lang w:val="fr-CA"/>
         </w:rPr>
         <w:t>req</w:t>
       </w:r>
@@ -21182,7 +21164,6 @@
           <w:color w:val="CCCCCC"/>
           <w:sz w:val="20"/>
           <w:szCs w:val="20"/>
-          <w:lang w:val="fr-CA"/>
         </w:rPr>
         <w:t xml:space="preserve">, </w:t>
       </w:r>
@@ -21191,7 +21172,6 @@
           <w:rFonts w:ascii="Times New Roman" w:hAnsi="Times New Roman"/>
           <w:sz w:val="20"/>
           <w:szCs w:val="20"/>
-          <w:lang w:val="fr-CA"/>
         </w:rPr>
         <w:t>res</w:t>
       </w:r>
@@ -21201,7 +21181,6 @@
           <w:color w:val="CCCCCC"/>
           <w:sz w:val="20"/>
           <w:szCs w:val="20"/>
-          <w:lang w:val="fr-CA"/>
         </w:rPr>
         <w:t xml:space="preserve">) </w:t>
       </w:r>
@@ -21210,7 +21189,6 @@
           <w:rFonts w:ascii="Times New Roman" w:hAnsi="Times New Roman"/>
           <w:sz w:val="20"/>
           <w:szCs w:val="20"/>
-          <w:lang w:val="fr-CA"/>
         </w:rPr>
         <w:t>=&gt;</w:t>
       </w:r>
@@ -21220,7 +21198,6 @@
           <w:color w:val="CCCCCC"/>
           <w:sz w:val="20"/>
           <w:szCs w:val="20"/>
-          <w:lang w:val="fr-CA"/>
         </w:rPr>
         <w:t xml:space="preserve"> {</w:t>
       </w:r>
@@ -21241,7 +21218,6 @@
           <w:color w:val="CCCCCC"/>
           <w:sz w:val="20"/>
           <w:szCs w:val="20"/>
-          <w:lang w:val="fr-CA"/>
         </w:rPr>
         <w:t xml:space="preserve">  </w:t>
       </w:r>
@@ -24062,7 +24038,7 @@
         </w:rPr>
         <w:t xml:space="preserve">React.js Documentation. </w:t>
       </w:r>
-      <w:hyperlink r:id="rId16" w:history="1">
+      <w:hyperlink r:id="rId17" w:history="1">
         <w:r>
           <w:rPr>
             <w:rStyle w:val="Hyperlink"/>
@@ -24094,7 +24070,7 @@
         <w:lastRenderedPageBreak/>
         <w:t xml:space="preserve">Twilio API Documentation. </w:t>
       </w:r>
-      <w:hyperlink r:id="rId17" w:history="1">
+      <w:hyperlink r:id="rId18" w:history="1">
         <w:r>
           <w:rPr>
             <w:rStyle w:val="Hyperlink"/>
@@ -24125,7 +24101,7 @@
         </w:rPr>
         <w:t xml:space="preserve">Brevo API Documentation </w:t>
       </w:r>
-      <w:hyperlink r:id="rId18" w:history="1">
+      <w:hyperlink r:id="rId19" w:history="1">
         <w:r>
           <w:rPr>
             <w:rStyle w:val="Hyperlink"/>
@@ -24148,7 +24124,7 @@
         </w:rPr>
         <w:t xml:space="preserve">Amazon S3 Documentation </w:t>
       </w:r>
-      <w:hyperlink r:id="rId19" w:history="1">
+      <w:hyperlink r:id="rId20" w:history="1">
         <w:r>
           <w:rPr>
             <w:rStyle w:val="Hyperlink"/>
@@ -24185,7 +24161,7 @@
         </w:rPr>
         <w:t xml:space="preserve">Express.js Documentation. </w:t>
       </w:r>
-      <w:hyperlink r:id="rId20" w:history="1">
+      <w:hyperlink r:id="rId21" w:history="1">
         <w:r>
           <w:rPr>
             <w:rStyle w:val="Hyperlink"/>

</xml_diff>

<commit_message>
Mise en place de la gesiyton globale des erreurs  Changes to be committed: 	modified:   backend/shared/.env 	new file:   frontend/src/components/GlobalError.js 	modified:   frontend/src/components/applyForm/ReviewForm.js 	modified:   frontend/src/index.js 	modified:   frontend/src/pages/ApplyForm.js 	new file:   images/1744784884501-67ed0d5af916fd44a745e6c7.pdf 	modified:   report.docx
</commit_message>
<xml_diff>
--- a/report.docx
+++ b/report.docx
@@ -220,16 +220,7 @@
           <w:rFonts w:ascii="Times New Roman" w:hAnsi="Times New Roman" w:cs="Times New Roman"/>
           <w:i/>
         </w:rPr>
-        <w:t>TECHNOL</w:t>
-      </w:r>
-      <w:bookmarkStart w:id="0" w:name="_GoBack"/>
-      <w:bookmarkEnd w:id="0"/>
-      <w:r>
-        <w:rPr>
-          <w:rFonts w:ascii="Times New Roman" w:hAnsi="Times New Roman" w:cs="Times New Roman"/>
-          <w:i/>
-        </w:rPr>
-        <w:t>OGY FACULTY</w:t>
+        <w:t>TECHNOLOGY FACULTY</w:t>
       </w:r>
     </w:p>
     <w:p>
@@ -324,6 +315,8 @@
           <w:docGrid w:linePitch="360"/>
         </w:sectPr>
       </w:pPr>
+      <w:bookmarkStart w:id="0" w:name="_GoBack"/>
+      <w:bookmarkEnd w:id="0"/>
     </w:p>
     <w:p>
       <w:pPr>

</xml_diff>